<commit_message>
Checkpoint: chat voice/menus, pantry history and removals, cook deduction
Work in progress saved before merging the admin console's server changes.

Co-Authored-By: Claude Opus 5.5 <noreply@anthropic.com>
</commit_message>
<xml_diff>
--- a/Checkpoint02_Panzi.docx
+++ b/Checkpoint02_Panzi.docx
@@ -621,7 +621,7 @@
                 <w:sz w:val="19"/>
                 <w:szCs w:val="19"/>
               </w:rPr>
-              <w:t xml:space="preserve">[FILL IN]</w:t>
+              <w:t xml:space="preserve">https://github.com/kemoceraldeup-arch/panzi</w:t>
             </w:r>
           </w:p>
         </w:tc>
@@ -1127,17 +1127,48 @@
     </w:p>
     <w:p>
       <w:pPr>
-        <w:spacing w:after="160"/>
+        <w:spacing w:after="200" w:before="120"/>
+        <w:jc w:val="center"/>
       </w:pPr>
       <w:r>
-        <w:rPr>
-          <w:i/>
-          <w:iCs/>
-          <w:color w:val="666666"/>
-          <w:sz w:val="18"/>
-          <w:szCs w:val="18"/>
-        </w:rPr>
-        <w:t xml:space="preserve">[INSERT MERN ARCHITECTURE DIAGRAM HERE — draw the flow: Expo App → (HTTPS + Firebase ID token) → Express API → Mongoose → MongoDB Atlas, with side calls out to Firebase Auth, OpenAI, FatSecret, and Supabase Storage.]</w:t>
+        <w:drawing>
+          <wp:inline distT="0" distB="0" distL="0" distR="0">
+            <wp:extent cx="6400800" cy="2095500"/>
+            <wp:effectExtent t="0" r="0" b="0" l="0"/>
+            <wp:docPr id="1" name="" descr="" title=""/>
+            <wp:cNvGraphicFramePr>
+              <a:graphicFrameLocks xmlns:a="http://schemas.openxmlformats.org/drawingml/2006/main" noChangeAspect="1"/>
+            </wp:cNvGraphicFramePr>
+            <a:graphic xmlns:a="http://schemas.openxmlformats.org/drawingml/2006/main">
+              <a:graphicData uri="http://schemas.openxmlformats.org/drawingml/2006/picture">
+                <pic:pic xmlns:pic="http://schemas.openxmlformats.org/drawingml/2006/picture">
+                  <pic:nvPicPr>
+                    <pic:cNvPr id="0" name="" descr=""/>
+                    <pic:cNvPicPr>
+                      <a:picLocks noChangeAspect="1" noChangeArrowheads="1"/>
+                    </pic:cNvPicPr>
+                  </pic:nvPicPr>
+                  <pic:blipFill>
+                    <a:blip r:embed="rId7" cstate="none"/>
+                    <a:srcRect/>
+                    <a:stretch>
+                      <a:fillRect/>
+                    </a:stretch>
+                  </pic:blipFill>
+                  <pic:spPr bwMode="auto">
+                    <a:xfrm>
+                      <a:off x="0" y="0"/>
+                      <a:ext cx="6400800" cy="2095500"/>
+                    </a:xfrm>
+                    <a:prstGeom prst="rect">
+                      <a:avLst/>
+                    </a:prstGeom>
+                  </pic:spPr>
+                </pic:pic>
+              </a:graphicData>
+            </a:graphic>
+          </wp:inline>
+        </w:drawing>
       </w:r>
     </w:p>
     <w:tbl>
@@ -13687,17 +13718,48 @@
     </w:p>
     <w:p>
       <w:pPr>
-        <w:spacing w:after="160"/>
+        <w:spacing w:after="200" w:before="120"/>
+        <w:jc w:val="center"/>
       </w:pPr>
       <w:r>
-        <w:rPr>
-          <w:i/>
-          <w:iCs/>
-          <w:color w:val="666666"/>
-          <w:sz w:val="18"/>
-          <w:szCs w:val="18"/>
-        </w:rPr>
-        <w:t xml:space="preserve">[INSERT DEPLOYMENT ARCHITECTURE DIAGRAM HERE — show: Phone (Expo app) —HTTPS→ Node host (Express API) —TLS→ MongoDB Atlas, with side arrows to Firebase Auth, OpenAI, FatSecret, Supabase Storage, each holding its own credential in the host's environment variables.]</w:t>
+        <w:drawing>
+          <wp:inline distT="0" distB="0" distL="0" distR="0">
+            <wp:extent cx="6400800" cy="3609975"/>
+            <wp:effectExtent t="0" r="0" b="0" l="0"/>
+            <wp:docPr id="1" name="" descr="" title=""/>
+            <wp:cNvGraphicFramePr>
+              <a:graphicFrameLocks xmlns:a="http://schemas.openxmlformats.org/drawingml/2006/main" noChangeAspect="1"/>
+            </wp:cNvGraphicFramePr>
+            <a:graphic xmlns:a="http://schemas.openxmlformats.org/drawingml/2006/main">
+              <a:graphicData uri="http://schemas.openxmlformats.org/drawingml/2006/picture">
+                <pic:pic xmlns:pic="http://schemas.openxmlformats.org/drawingml/2006/picture">
+                  <pic:nvPicPr>
+                    <pic:cNvPr id="0" name="" descr=""/>
+                    <pic:cNvPicPr>
+                      <a:picLocks noChangeAspect="1" noChangeArrowheads="1"/>
+                    </pic:cNvPicPr>
+                  </pic:nvPicPr>
+                  <pic:blipFill>
+                    <a:blip r:embed="rId8" cstate="none"/>
+                    <a:srcRect/>
+                    <a:stretch>
+                      <a:fillRect/>
+                    </a:stretch>
+                  </pic:blipFill>
+                  <pic:spPr bwMode="auto">
+                    <a:xfrm>
+                      <a:off x="0" y="0"/>
+                      <a:ext cx="6400800" cy="3609975"/>
+                    </a:xfrm>
+                    <a:prstGeom prst="rect">
+                      <a:avLst/>
+                    </a:prstGeom>
+                  </pic:spPr>
+                </pic:pic>
+              </a:graphicData>
+            </a:graphic>
+          </wp:inline>
+        </w:drawing>
       </w:r>
     </w:p>
     <w:p>
@@ -16955,7 +17017,7 @@
                 <w:sz w:val="19"/>
                 <w:szCs w:val="19"/>
               </w:rPr>
-              <w:t xml:space="preserve">[FILL IN]</w:t>
+              <w:t xml:space="preserve">https://github.com/kemoceraldeup-arch/panzi</w:t>
             </w:r>
           </w:p>
         </w:tc>

</xml_diff>